<commit_message>
add assignment 2 files
</commit_message>
<xml_diff>
--- a/Assignment 1.docx
+++ b/Assignment 1.docx
@@ -17,6 +17,92 @@
           <w:bCs/>
         </w:rPr>
         <w:t>Assignment 1</w:t>
+      </w:r>
+    </w:p>
+    <w:p>
+      <w:pPr>
+        <w:rPr>
+          <w:rFonts w:ascii="Times New Roman" w:hAnsi="Times New Roman" w:cs="Times New Roman"/>
+          <w:b/>
+          <w:bCs/>
+        </w:rPr>
+      </w:pPr>
+      <w:r>
+        <w:rPr>
+          <w:rFonts w:ascii="Times New Roman" w:hAnsi="Times New Roman" w:cs="Times New Roman"/>
+          <w:b/>
+          <w:bCs/>
+        </w:rPr>
+        <w:t>Quarto Website</w:t>
+      </w:r>
+    </w:p>
+    <w:p>
+      <w:pPr>
+        <w:rPr>
+          <w:rFonts w:ascii="Times New Roman" w:hAnsi="Times New Roman" w:cs="Times New Roman"/>
+        </w:rPr>
+      </w:pPr>
+      <w:r>
+        <w:rPr>
+          <w:rFonts w:ascii="Times New Roman" w:hAnsi="Times New Roman" w:cs="Times New Roman"/>
+        </w:rPr>
+        <w:t>Audrey</w:t>
+      </w:r>
+      <w:r>
+        <w:rPr>
+          <w:rFonts w:ascii="Times New Roman" w:hAnsi="Times New Roman" w:cs="Times New Roman"/>
+        </w:rPr>
+        <w:t xml:space="preserve"> Johnson</w:t>
+      </w:r>
+    </w:p>
+    <w:p>
+      <w:pPr>
+        <w:rPr>
+          <w:rFonts w:ascii="Times New Roman" w:hAnsi="Times New Roman" w:cs="Times New Roman"/>
+        </w:rPr>
+      </w:pPr>
+    </w:p>
+    <w:p>
+      <w:pPr>
+        <w:rPr>
+          <w:rFonts w:ascii="Times New Roman" w:hAnsi="Times New Roman" w:cs="Times New Roman"/>
+        </w:rPr>
+      </w:pPr>
+      <w:r>
+        <w:rPr>
+          <w:rFonts w:ascii="Times New Roman" w:hAnsi="Times New Roman" w:cs="Times New Roman"/>
+        </w:rPr>
+        <w:t>This assignment required creating a personal Quarto website hosted</w:t>
+      </w:r>
+      <w:r>
+        <w:rPr>
+          <w:rFonts w:ascii="Times New Roman" w:hAnsi="Times New Roman" w:cs="Times New Roman"/>
+        </w:rPr>
+        <w:t xml:space="preserve"> on</w:t>
+      </w:r>
+      <w:r>
+        <w:rPr>
+          <w:rFonts w:ascii="Times New Roman" w:hAnsi="Times New Roman" w:cs="Times New Roman"/>
+        </w:rPr>
+        <w:t xml:space="preserve"> GitHub </w:t>
+      </w:r>
+      <w:r>
+        <w:rPr>
+          <w:rFonts w:ascii="Times New Roman" w:hAnsi="Times New Roman" w:cs="Times New Roman"/>
+        </w:rPr>
+        <w:t>Pages. The website includes Home, CV, Contact, and Blo</w:t>
+      </w:r>
+      <w:r>
+        <w:rPr>
+          <w:rFonts w:ascii="Times New Roman" w:hAnsi="Times New Roman" w:cs="Times New Roman"/>
+        </w:rPr>
+        <w:t xml:space="preserve">g pages. </w:t>
+      </w:r>
+      <w:r>
+        <w:rPr>
+          <w:rFonts w:ascii="Times New Roman" w:hAnsi="Times New Roman" w:cs="Times New Roman"/>
+        </w:rPr>
+        <w:t>A blog post was created to display assignment submissions.</w:t>
       </w:r>
     </w:p>
     <w:sectPr>

</xml_diff>